<commit_message>
update sdr implementation in readme
</commit_message>
<xml_diff>
--- a/MySEProject/Documentation/ML22-23-8 Implement the SDR representation in the MAUI application.docx
+++ b/MySEProject/Documentation/ML22-23-8 Implement the SDR representation in the MAUI application.docx
@@ -7,6 +7,8 @@
         <w:pStyle w:val="papertitle"/>
         <w:spacing w:before="100" w:beforeAutospacing="1" w:after="100" w:afterAutospacing="1"/>
       </w:pPr>
+      <w:bookmarkStart w:id="0" w:name="_GoBack"/>
+      <w:bookmarkEnd w:id="0"/>
       <w:r>
         <w:t>Implement the SDR representation in the MAUI application</w:t>
       </w:r>
@@ -182,20 +184,7 @@
         <w:t>—</w:t>
       </w:r>
       <w:r>
-        <w:t xml:space="preserve"> Due to the drastic demand of users in problems involving real-time solutions, Software developers have options for using sufficient frameworks. In the specification of the app user, a cross-platform framework, .NET Multi-platform App User Interface (.NET MAUI), is a good choice for developers to implement their models compatibly on multiple devices with less work. Besides, a separation in MAUI structure of visualization and functions provides better keeping up with the app development. This paper shows th</w:t>
-      </w:r>
-      <w:bookmarkStart w:id="0" w:name="_GoBack"/>
-      <w:bookmarkEnd w:id="0"/>
-      <w:r>
-        <w:t xml:space="preserve">e creation of a .NET MAUI app to interact with users via User Interface (UI). The structure of vital iterations in generating the MAUI app is specified. The purpose is to replace the current Sparse Distributed Representation (SDR) visualization with a simpler and more efficient tool, the new library for SDR drawing implemented using </w:t>
-      </w:r>
-      <w:proofErr w:type="spellStart"/>
-      <w:r>
-        <w:t>Maui.Graphics</w:t>
-      </w:r>
-      <w:proofErr w:type="spellEnd"/>
-      <w:r>
-        <w:t>.</w:t>
+        <w:t xml:space="preserve"> Due to the drastic demand of users in problems involving real-time solutions, Software developers have options for using sufficient frameworks. In the specification of the app user, a cross-platform framework, .NET Multi-platform App User Interface (.NET MAUI), is a good choice for developers to implement their models compatibly on multiple devices with less work. Besides, a separation in MAUI structure of visualization and functions provides better keeping up with the app development. This paper shows the creation of a .NET MAUI app to interact with users via User Interface (UI). The structure of vital iterations in generating the MAUI app is specified. The purpose is to replace the current Sparse Distributed Representation (SDR) visualization with a simpler and more efficient tool, the new library for SDR drawing implemented using Maui.Graphics.</w:t>
       </w:r>
     </w:p>
     <w:p>
@@ -206,18 +195,10 @@
         <w:t>Keywords—</w:t>
       </w:r>
       <w:r>
-        <w:t xml:space="preserve">MAUI, </w:t>
-      </w:r>
-      <w:proofErr w:type="spellStart"/>
-      <w:r>
-        <w:t>Maui</w:t>
-      </w:r>
-      <w:r>
-        <w:t>.Graphics</w:t>
-      </w:r>
-      <w:proofErr w:type="spellEnd"/>
-      <w:r>
-        <w:t xml:space="preserve">, </w:t>
+        <w:t>MAUI, Maui</w:t>
+      </w:r>
+      <w:r>
+        <w:t xml:space="preserve">.Graphics, </w:t>
       </w:r>
       <w:r>
         <w:t>User Interface (</w:t>
@@ -238,15 +219,7 @@
         <w:t xml:space="preserve"> Data Binding, XAML, </w:t>
       </w:r>
       <w:r>
-        <w:t>Model-View-</w:t>
-      </w:r>
-      <w:proofErr w:type="spellStart"/>
-      <w:r>
-        <w:t>ViewModel</w:t>
-      </w:r>
-      <w:proofErr w:type="spellEnd"/>
-      <w:r>
-        <w:t xml:space="preserve">, </w:t>
+        <w:t xml:space="preserve">Model-View-ViewModel, </w:t>
       </w:r>
       <w:r>
         <w:t>Sparse Distributed Representation (SDR)</w:t>
@@ -525,23 +498,7 @@
         <w:pStyle w:val="BodyText"/>
       </w:pPr>
       <w:r>
-        <w:t xml:space="preserve">Define abbreviations and acronyms the first time they are used in the text, even after they have been defined in the abstract. Abbreviations such as IEEE, SI, MKS, CGS, </w:t>
-      </w:r>
-      <w:proofErr w:type="spellStart"/>
-      <w:r>
-        <w:t>sc</w:t>
-      </w:r>
-      <w:proofErr w:type="spellEnd"/>
-      <w:r>
-        <w:t xml:space="preserve">, dc, and </w:t>
-      </w:r>
-      <w:proofErr w:type="spellStart"/>
-      <w:r>
-        <w:t>rms</w:t>
-      </w:r>
-      <w:proofErr w:type="spellEnd"/>
-      <w:r>
-        <w:t xml:space="preserve"> do not have to be defined. Do not use abbreviations in the title or heads unless they are unavoidable.</w:t>
+        <w:t>Define abbreviations and acronyms the first time they are used in the text, even after they have been defined in the abstract. Abbreviations such as IEEE, SI, MKS, CGS, sc, dc, and rms do not have to be defined. Do not use abbreviations in the title or heads unless they are unavoidable.</w:t>
       </w:r>
     </w:p>
     <w:p>
@@ -572,15 +529,7 @@
       </w:pPr>
       <w:r>
         <w:lastRenderedPageBreak/>
-        <w:t xml:space="preserve">Avoid combining SI and CGS units, such as current in amperes and magnetic field in </w:t>
-      </w:r>
-      <w:proofErr w:type="spellStart"/>
-      <w:r>
-        <w:t>oersteds</w:t>
-      </w:r>
-      <w:proofErr w:type="spellEnd"/>
-      <w:r>
-        <w:t>. This often leads to confusion because equations do not balance dimensionally. If you must use mixed units, clearly state the units for each quantity that you use in an equation.</w:t>
+        <w:t>Avoid combining SI and CGS units, such as current in amperes and magnetic field in oersteds. This often leads to confusion because equations do not balance dimensionally. If you must use mixed units, clearly state the units for each quantity that you use in an equation.</w:t>
       </w:r>
     </w:p>
     <w:p>
@@ -588,15 +537,7 @@
         <w:pStyle w:val="bulletlist"/>
       </w:pPr>
       <w:r>
-        <w:t xml:space="preserve">Do not mix complete spellings and abbreviations of units: “Wb/m2” or “webers per square meter”, not “webers/m2”.  Spell out units when they appear in text: “. . . a few </w:t>
-      </w:r>
-      <w:proofErr w:type="spellStart"/>
-      <w:r>
-        <w:t>henries</w:t>
-      </w:r>
-      <w:proofErr w:type="spellEnd"/>
-      <w:r>
-        <w:t>”, not “. . . a few H”.</w:t>
+        <w:t>Do not mix complete spellings and abbreviations of units: “Wb/m2” or “webers per square meter”, not “webers/m2”.  Spell out units when they appear in text: “. . . a few henries”, not “. . . a few H”.</w:t>
       </w:r>
     </w:p>
     <w:p>
@@ -1436,7 +1377,7 @@
             <v:path o:extrusionok="f" gradientshapeok="t" o:connecttype="rect"/>
             <o:lock v:ext="edit" aspectratio="t"/>
           </v:shapetype>
-          <v:shape id="_x0000_i1027" type="#_x0000_t75" style="width:228.6pt;height:31.8pt" o:bordertopcolor="this" o:borderleftcolor="this" o:borderbottomcolor="this" o:borderrightcolor="this">
+          <v:shape id="_x0000_i1026" type="#_x0000_t75" style="width:228.75pt;height:31.8pt" o:bordertopcolor="this" o:borderleftcolor="this" o:borderbottomcolor="this" o:borderrightcolor="this">
             <v:imagedata r:id="rId12" o:title=""/>
             <w10:bordertop type="single" width="8"/>
             <w10:borderleft type="single" width="8"/>
@@ -1612,6 +1553,7 @@
                 </w:p>
               </w:txbxContent>
             </v:textbox>
+            <w10:wrap type="none"/>
             <w10:anchorlock/>
           </v:shape>
         </w:pict>
@@ -1643,25 +1585,13 @@
           <w:b/>
           <w:bCs/>
         </w:rPr>
-        <w:t xml:space="preserve">Error! Reference source not </w:t>
-      </w:r>
-      <w:proofErr w:type="gramStart"/>
-      <w:r>
-        <w:rPr>
-          <w:b/>
-          <w:bCs/>
-        </w:rPr>
-        <w:t>found.</w:t>
+        <w:t>Error! Reference source not found.</w:t>
       </w:r>
       <w:r>
         <w:fldChar w:fldCharType="end"/>
       </w:r>
       <w:r>
-        <w:t>,</w:t>
-      </w:r>
-      <w:proofErr w:type="gramEnd"/>
-      <w:r>
-        <w:t xml:space="preserve"> italics should be used </w:t>
+        <w:t xml:space="preserve">, italics should be used </w:t>
       </w:r>
       <w:r>
         <w:t xml:space="preserve">for example </w:t>
@@ -1744,7 +1674,6 @@
         <w:t xml:space="preserve">Unit Test </w:t>
       </w:r>
       <w:hyperlink r:id="rId13" w:anchor="L34-L49" w:history="1">
-        <w:proofErr w:type="spellStart"/>
         <w:r>
           <w:rPr>
             <w:rStyle w:val="Hyperlink"/>
@@ -1752,7 +1681,6 @@
           </w:rPr>
           <w:t>EncodeDateTimeTest</w:t>
         </w:r>
-        <w:proofErr w:type="spellEnd"/>
       </w:hyperlink>
       <w:bookmarkEnd w:id="5"/>
     </w:p>
@@ -1828,6 +1756,7 @@
                 </w:p>
               </w:txbxContent>
             </v:textbox>
+            <w10:wrap type="none"/>
             <w10:anchorlock/>
           </v:shape>
         </w:pict>
@@ -2266,7 +2195,7 @@
       <w:r>
         <w:lastRenderedPageBreak/>
         <w:pict w14:anchorId="4A67007D">
-          <v:shape id="_x0000_s1032" type="#_x0000_t202" style="position:absolute;left:0;text-align:left;margin-left:0;margin-top:19.8pt;width:252pt;height:90pt;z-index:-1;mso-wrap-edited:f;mso-position-horizontal:left;mso-position-horizontal-relative:margin" wrapcoords="-64 0 -64 21600 21664 21600 21664 0 -64 0">
+          <v:shape id="_x0000_s1032" type="#_x0000_t202" style="position:absolute;left:0;text-align:left;margin-left:0;margin-top:19.8pt;width:252pt;height:90pt;z-index:-251659776;mso-wrap-edited:f;mso-position-horizontal:left;mso-position-horizontal-relative:margin" wrapcoords="-64 0 -64 21600 21664 21600 21664 0 -64 0">
             <v:textbox style="mso-next-textbox:#_x0000_s1032">
               <w:txbxContent>
                 <w:p>
@@ -2458,7 +2387,7 @@
                 <v:path o:extrusionok="f" gradientshapeok="t" o:connecttype="rect"/>
                 <o:lock v:ext="edit" aspectratio="t"/>
               </v:shapetype>
-              <v:shape id="Grafik 4" o:spid="_x0000_i1028" type="#_x0000_t75" style="width:96pt;height:49.8pt;visibility:visible">
+              <v:shape id="Grafik 4" o:spid="_x0000_i1025" type="#_x0000_t75" style="width:96pt;height:49.8pt;visibility:visible">
                 <v:imagedata r:id="rId1" o:title=""/>
               </v:shape>
             </w:pict>
@@ -5166,7 +5095,7 @@
   <a:extraClrSchemeLst/>
   <a:extLst>
     <a:ext uri="{05A4C25C-085E-4340-85A3-A5531E510DB2}">
-      <thm15:themeFamily xmlns="" xmlns:thm15="http://schemas.microsoft.com/office/thememl/2012/main" name="Office Theme" id="{62F939B6-93AF-4DB8-9C6B-D6C7DFDC589F}" vid="{4A3C46E8-61CC-4603-A589-7422A47A8E4A}"/>
+      <thm15:themeFamily xmlns:thm15="http://schemas.microsoft.com/office/thememl/2012/main" xmlns="" name="Office Theme" id="{62F939B6-93AF-4DB8-9C6B-D6C7DFDC589F}" vid="{4A3C46E8-61CC-4603-A589-7422A47A8E4A}"/>
     </a:ext>
   </a:extLst>
 </a:theme>
@@ -5177,7 +5106,7 @@
 </file>
 
 <file path=customXml/itemProps1.xml><?xml version="1.0" encoding="utf-8"?>
-<ds:datastoreItem xmlns:ds="http://schemas.openxmlformats.org/officeDocument/2006/customXml" ds:itemID="{6431F736-D032-4B53-9804-FB305B1F8B96}">
+<ds:datastoreItem xmlns:ds="http://schemas.openxmlformats.org/officeDocument/2006/customXml" ds:itemID="{5C8D0330-8DC0-4F75-A9D0-C651D61EAA6C}">
   <ds:schemaRefs>
     <ds:schemaRef ds:uri="http://schemas.openxmlformats.org/officeDocument/2006/bibliography"/>
   </ds:schemaRefs>

</xml_diff>